<commit_message>
Add professional QR code pointing to portfolio in Resume OS v3 header
</commit_message>
<xml_diff>
--- a/resume-v3/Resume_v3.docx
+++ b/resume-v3/Resume_v3.docx
@@ -2,107 +2,218 @@
 <file path=word/document.xml><?xml version="1.0" encoding="utf-8"?>
 <w:document xmlns:wpc="http://schemas.microsoft.com/office/word/2010/wordprocessingCanvas" xmlns:mo="http://schemas.microsoft.com/office/mac/office/2008/main" xmlns:mc="http://schemas.openxmlformats.org/markup-compatibility/2006" xmlns:mv="urn:schemas-microsoft-com:mac:vml" xmlns:o="urn:schemas-microsoft-com:office:office" xmlns:r="http://schemas.openxmlformats.org/officeDocument/2006/relationships" xmlns:m="http://schemas.openxmlformats.org/officeDocument/2006/math" xmlns:v="urn:schemas-microsoft-com:vml" xmlns:wp14="http://schemas.microsoft.com/office/word/2010/wordprocessingDrawing" xmlns:wp="http://schemas.openxmlformats.org/drawingml/2006/wordprocessingDrawing" xmlns:w10="urn:schemas-microsoft-com:office:word" xmlns:w="http://schemas.openxmlformats.org/wordprocessingml/2006/main" xmlns:w14="http://schemas.microsoft.com/office/word/2010/wordml" xmlns:wpg="http://schemas.microsoft.com/office/word/2010/wordprocessingGroup" xmlns:wpi="http://schemas.microsoft.com/office/word/2010/wordprocessingInk" xmlns:wne="http://schemas.microsoft.com/office/word/2006/wordml" xmlns:wps="http://schemas.microsoft.com/office/word/2010/wordprocessingShape" mc:Ignorable="w14 wp14">
   <w:body>
-    <w:p>
-      <w:pPr>
-        <w:spacing w:after="20"/>
-        <w:jc w:val="center"/>
-      </w:pPr>
-      <w:r>
-        <w:rPr>
-          <w:b/>
-          <w:color w:val="1B365D"/>
-          <w:sz w:val="32"/>
-        </w:rPr>
-        <w:t>RISHABH JAIN</w:t>
-        <w:br/>
-      </w:r>
-    </w:p>
-    <w:p>
-      <w:pPr>
-        <w:spacing w:after="80"/>
-        <w:jc w:val="center"/>
-      </w:pPr>
-      <w:r>
-        <w:rPr>
-          <w:rFonts w:ascii="Arial" w:hAnsi="Arial"/>
-          <w:color w:val="555555"/>
-          <w:sz w:val="17"/>
-        </w:rPr>
-        <w:t xml:space="preserve">+91 9258121291  |  </w:t>
-      </w:r>
-      <w:hyperlink r:id="rId9">
-        <w:r>
-          <w:rPr>
-            <w:rFonts w:ascii="Arial" w:hAnsi="Arial"/>
-            <w:sz w:val="17"/>
-            <w:color w:val="1B365D"/>
-            <w:u w:val="single"/>
-          </w:rPr>
-          <w:t>rishabhjain071130@gmail.com</w:t>
-        </w:r>
-      </w:hyperlink>
-      <w:r>
-        <w:rPr>
-          <w:rFonts w:ascii="Arial" w:hAnsi="Arial"/>
-          <w:color w:val="555555"/>
-          <w:sz w:val="17"/>
-        </w:rPr>
-        <w:t xml:space="preserve">  |  </w:t>
-      </w:r>
-      <w:hyperlink r:id="rId10">
-        <w:r>
-          <w:rPr>
-            <w:rFonts w:ascii="Arial" w:hAnsi="Arial"/>
-            <w:sz w:val="17"/>
-            <w:color w:val="1B365D"/>
-            <w:u w:val="single"/>
-          </w:rPr>
-          <w:t>rishabh-jain-one.vercel.app</w:t>
-        </w:r>
-      </w:hyperlink>
-      <w:r>
-        <w:rPr>
-          <w:rFonts w:ascii="Arial" w:hAnsi="Arial"/>
-          <w:color w:val="555555"/>
-          <w:sz w:val="17"/>
-        </w:rPr>
-        <w:br/>
-      </w:r>
-      <w:hyperlink r:id="rId11">
-        <w:r>
-          <w:rPr>
-            <w:rFonts w:ascii="Arial" w:hAnsi="Arial"/>
-            <w:sz w:val="17"/>
-            <w:color w:val="1B365D"/>
-            <w:u w:val="single"/>
-          </w:rPr>
-          <w:t>github.com/rishabhjain071130-glitch/rishabh-jain</w:t>
-        </w:r>
-      </w:hyperlink>
-      <w:r>
-        <w:rPr>
-          <w:rFonts w:ascii="Arial" w:hAnsi="Arial"/>
-          <w:color w:val="555555"/>
-          <w:sz w:val="17"/>
-        </w:rPr>
-        <w:t xml:space="preserve">  |  </w:t>
-      </w:r>
-      <w:hyperlink r:id="rId12">
-        <w:r>
-          <w:rPr>
-            <w:rFonts w:ascii="Arial" w:hAnsi="Arial"/>
-            <w:sz w:val="17"/>
-            <w:color w:val="1B365D"/>
-            <w:u w:val="single"/>
-          </w:rPr>
-          <w:t>linkedin.com/in/rishabh-jain-40079a396</w:t>
-        </w:r>
-      </w:hyperlink>
-    </w:p>
+    <w:tbl>
+      <w:tblPr>
+        <w:tblW w:type="auto" w:w="0"/>
+        <w:tblLayout w:type="fixed"/>
+        <w:tblLook w:firstColumn="1" w:firstRow="1" w:lastColumn="0" w:lastRow="0" w:noHBand="0" w:noVBand="1" w:val="04A0"/>
+      </w:tblPr>
+      <w:tblGrid>
+        <w:gridCol w:w="1584"/>
+        <w:gridCol w:w="7632"/>
+        <w:gridCol w:w="1584"/>
+      </w:tblGrid>
+      <w:tr>
+        <w:tc>
+          <w:tcPr>
+            <w:tcW w:type="dxa" w:w="3600"/>
+            <w:tcMar>
+              <w:top w:w="0" w:type="dxa"/>
+              <w:bottom w:w="0" w:type="dxa"/>
+              <w:left w:w="0" w:type="dxa"/>
+              <w:right w:w="0" w:type="dxa"/>
+            </w:tcMar>
+          </w:tcPr>
+          <w:p>
+            <w:pPr>
+              <w:spacing w:after="0" w:before="0"/>
+            </w:pPr>
+            <w:r>
+              <w:rPr>
+                <w:sz w:val="2"/>
+              </w:rPr>
+            </w:r>
+          </w:p>
+        </w:tc>
+        <w:tc>
+          <w:tcPr>
+            <w:tcW w:type="dxa" w:w="3600"/>
+            <w:tcMar>
+              <w:top w:w="0" w:type="dxa"/>
+              <w:bottom w:w="0" w:type="dxa"/>
+              <w:left w:w="0" w:type="dxa"/>
+              <w:right w:w="0" w:type="dxa"/>
+            </w:tcMar>
+          </w:tcPr>
+          <w:p>
+            <w:pPr>
+              <w:spacing w:after="20" w:before="0"/>
+              <w:jc w:val="center"/>
+            </w:pPr>
+            <w:r>
+              <w:rPr>
+                <w:b/>
+                <w:color w:val="1B365D"/>
+                <w:sz w:val="32"/>
+              </w:rPr>
+              <w:t>RISHABH JAIN</w:t>
+              <w:br/>
+            </w:r>
+          </w:p>
+          <w:p>
+            <w:pPr>
+              <w:spacing w:after="80" w:before="0"/>
+              <w:jc w:val="center"/>
+            </w:pPr>
+            <w:r>
+              <w:rPr>
+                <w:rFonts w:ascii="Arial" w:hAnsi="Arial"/>
+                <w:color w:val="555555"/>
+                <w:sz w:val="17"/>
+              </w:rPr>
+              <w:t xml:space="preserve">+91 9258121291  |  </w:t>
+            </w:r>
+            <w:hyperlink r:id="rId9">
+              <w:r>
+                <w:rPr>
+                  <w:rFonts w:ascii="Arial" w:hAnsi="Arial"/>
+                  <w:sz w:val="17"/>
+                  <w:color w:val="1B365D"/>
+                  <w:u w:val="single"/>
+                </w:rPr>
+                <w:t>rishabhjain071130@gmail.com</w:t>
+              </w:r>
+            </w:hyperlink>
+            <w:r>
+              <w:rPr>
+                <w:rFonts w:ascii="Arial" w:hAnsi="Arial"/>
+                <w:color w:val="555555"/>
+                <w:sz w:val="17"/>
+              </w:rPr>
+              <w:t xml:space="preserve">  |  </w:t>
+            </w:r>
+            <w:hyperlink r:id="rId10">
+              <w:r>
+                <w:rPr>
+                  <w:rFonts w:ascii="Arial" w:hAnsi="Arial"/>
+                  <w:sz w:val="17"/>
+                  <w:color w:val="1B365D"/>
+                  <w:u w:val="single"/>
+                </w:rPr>
+                <w:t>rishabh-jain-one.vercel.app</w:t>
+              </w:r>
+            </w:hyperlink>
+            <w:r>
+              <w:rPr>
+                <w:rFonts w:ascii="Arial" w:hAnsi="Arial"/>
+                <w:color w:val="555555"/>
+                <w:sz w:val="17"/>
+              </w:rPr>
+              <w:br/>
+            </w:r>
+            <w:hyperlink r:id="rId11">
+              <w:r>
+                <w:rPr>
+                  <w:rFonts w:ascii="Arial" w:hAnsi="Arial"/>
+                  <w:sz w:val="17"/>
+                  <w:color w:val="1B365D"/>
+                  <w:u w:val="single"/>
+                </w:rPr>
+                <w:t>github.com/rishabhjain071130-glitch/rishabh-jain</w:t>
+              </w:r>
+            </w:hyperlink>
+            <w:r>
+              <w:rPr>
+                <w:rFonts w:ascii="Arial" w:hAnsi="Arial"/>
+                <w:color w:val="555555"/>
+                <w:sz w:val="17"/>
+              </w:rPr>
+              <w:t xml:space="preserve">  |  </w:t>
+            </w:r>
+            <w:hyperlink r:id="rId12">
+              <w:r>
+                <w:rPr>
+                  <w:rFonts w:ascii="Arial" w:hAnsi="Arial"/>
+                  <w:sz w:val="17"/>
+                  <w:color w:val="1B365D"/>
+                  <w:u w:val="single"/>
+                </w:rPr>
+                <w:t>linkedin.com/in/rishabh-jain-40079a396</w:t>
+              </w:r>
+            </w:hyperlink>
+          </w:p>
+        </w:tc>
+        <w:tc>
+          <w:tcPr>
+            <w:tcW w:type="dxa" w:w="3600"/>
+            <w:tcMar>
+              <w:top w:w="0" w:type="dxa"/>
+              <w:bottom w:w="0" w:type="dxa"/>
+              <w:left w:w="0" w:type="dxa"/>
+              <w:right w:w="0" w:type="dxa"/>
+            </w:tcMar>
+          </w:tcPr>
+          <w:p>
+            <w:pPr>
+              <w:spacing w:after="0" w:before="0"/>
+              <w:jc w:val="right"/>
+            </w:pPr>
+            <w:r>
+              <w:drawing>
+                <wp:inline xmlns:a="http://schemas.openxmlformats.org/drawingml/2006/main" xmlns:pic="http://schemas.openxmlformats.org/drawingml/2006/picture">
+                  <wp:extent cx="896112" cy="896112"/>
+                  <wp:docPr id="1" name="Picture 1"/>
+                  <wp:cNvGraphicFramePr>
+                    <a:graphicFrameLocks noChangeAspect="1"/>
+                  </wp:cNvGraphicFramePr>
+                  <a:graphic>
+                    <a:graphicData uri="http://schemas.openxmlformats.org/drawingml/2006/picture">
+                      <pic:pic>
+                        <pic:nvPicPr>
+                          <pic:cNvPr id="0" name="qrcode.png"/>
+                          <pic:cNvPicPr/>
+                        </pic:nvPicPr>
+                        <pic:blipFill>
+                          <a:blip r:embed="rId13"/>
+                          <a:stretch>
+                            <a:fillRect/>
+                          </a:stretch>
+                        </pic:blipFill>
+                        <pic:spPr>
+                          <a:xfrm>
+                            <a:off x="0" y="0"/>
+                            <a:ext cx="896112" cy="896112"/>
+                          </a:xfrm>
+                          <a:prstGeom prst="rect"/>
+                        </pic:spPr>
+                      </pic:pic>
+                    </a:graphicData>
+                  </a:graphic>
+                </wp:inline>
+              </w:drawing>
+            </w:r>
+          </w:p>
+          <w:p>
+            <w:pPr>
+              <w:spacing w:after="0" w:before="20"/>
+              <w:jc w:val="right"/>
+            </w:pPr>
+            <w:r>
+              <w:rPr>
+                <w:rFonts w:ascii="Arial" w:hAnsi="Arial"/>
+                <w:color w:val="777777"/>
+                <w:sz w:val="13"/>
+              </w:rPr>
+              <w:t>Scan to view Portfolio</w:t>
+            </w:r>
+          </w:p>
+        </w:tc>
+      </w:tr>
+    </w:tbl>
     <w:p>
       <w:pPr>
         <w:keepNext/>
-        <w:spacing w:before="120" w:after="40"/>
+        <w:spacing w:before="90" w:after="20"/>
         <w:pBdr>
           <w:bottom w:val="single" w:sz="6" w:space="1" w:color="A0A0A0"/>
         </w:pBdr>
@@ -127,7 +238,7 @@
     <w:p>
       <w:pPr>
         <w:keepNext/>
-        <w:spacing w:before="120" w:after="40"/>
+        <w:spacing w:before="90" w:after="20"/>
         <w:pBdr>
           <w:bottom w:val="single" w:sz="6" w:space="1" w:color="A0A0A0"/>
         </w:pBdr>
@@ -269,7 +380,7 @@
     <w:p>
       <w:pPr>
         <w:keepNext/>
-        <w:spacing w:before="120" w:after="40"/>
+        <w:spacing w:before="90" w:after="20"/>
         <w:pBdr>
           <w:bottom w:val="single" w:sz="6" w:space="1" w:color="A0A0A0"/>
         </w:pBdr>
@@ -356,7 +467,7 @@
     <w:p>
       <w:pPr>
         <w:keepNext/>
-        <w:spacing w:before="120" w:after="40"/>
+        <w:spacing w:before="90" w:after="20"/>
         <w:pBdr>
           <w:bottom w:val="single" w:sz="6" w:space="1" w:color="A0A0A0"/>
         </w:pBdr>
@@ -421,7 +532,7 @@
       <w:r>
         <w:t xml:space="preserve"> (Python, Streamlit, Gemini API, HTML, CSS, Git) | </w:t>
       </w:r>
-      <w:hyperlink r:id="rId13">
+      <w:hyperlink r:id="rId14">
         <w:r>
           <w:rPr>
             <w:rFonts w:ascii="Arial" w:hAnsi="Arial"/>
@@ -458,7 +569,7 @@
       <w:r>
         <w:t xml:space="preserve"> (Node.js, Express.js, MongoDB, Mongoose, HTML, CSS) | </w:t>
       </w:r>
-      <w:hyperlink r:id="rId14">
+      <w:hyperlink r:id="rId15">
         <w:r>
           <w:rPr>
             <w:rFonts w:ascii="Arial" w:hAnsi="Arial"/>
@@ -484,7 +595,7 @@
     <w:p>
       <w:pPr>
         <w:keepNext/>
-        <w:spacing w:before="120" w:after="40"/>
+        <w:spacing w:before="90" w:after="20"/>
         <w:pBdr>
           <w:bottom w:val="single" w:sz="6" w:space="1" w:color="A0A0A0"/>
         </w:pBdr>
@@ -671,7 +782,7 @@
     <w:p>
       <w:pPr>
         <w:keepNext/>
-        <w:spacing w:before="120" w:after="40"/>
+        <w:spacing w:before="90" w:after="20"/>
         <w:pBdr>
           <w:bottom w:val="single" w:sz="6" w:space="1" w:color="A0A0A0"/>
         </w:pBdr>
@@ -800,7 +911,7 @@
     <w:p>
       <w:pPr>
         <w:keepNext/>
-        <w:spacing w:before="120" w:after="40"/>
+        <w:spacing w:before="90" w:after="20"/>
         <w:pBdr>
           <w:bottom w:val="single" w:sz="6" w:space="1" w:color="A0A0A0"/>
         </w:pBdr>
@@ -846,7 +957,7 @@
     </w:p>
     <w:sectPr>
       <w:pgSz w:w="12240" w:h="15840"/>
-      <w:pgMar w:top="720" w:right="720" w:bottom="720" w:left="720" w:header="720" w:footer="720" w:gutter="0"/>
+      <w:pgMar w:top="504" w:right="720" w:bottom="504" w:left="720" w:header="720" w:footer="720" w:gutter="0"/>
       <w:cols w:space="720"/>
       <w:docGrid w:linePitch="360"/>
     </w:sectPr>
@@ -1218,7 +1329,7 @@
     <w:qFormat/>
     <w:rsid w:val="00FC693F"/>
     <w:pPr>
-      <w:spacing w:line="252" w:lineRule="auto" w:after="0" w:before="0"/>
+      <w:spacing w:line="245" w:lineRule="auto" w:after="0" w:before="0"/>
     </w:pPr>
     <w:rPr>
       <w:rFonts w:ascii="Arial" w:hAnsi="Arial"/>

</xml_diff>